<commit_message>
Optimize feed proxy timeout, O(1) message ingestion, deduplication key fallback and updated final report
</commit_message>
<xml_diff>
--- a/Lab6_Final_Report_Kakarla_Soma_Charith_Reddy.docx
+++ b/Lab6_Final_Report_Kakarla_Soma_Charith_Reddy.docx
@@ -73,6 +73,8 @@
               <w:t>• Roll ID: 12341040</w:t>
               <w:br/>
               <w:t>• Submission Load Balancer URL: http://10.1.75.51:3246</w:t>
+              <w:br/>
+              <w:t>• GitHub Source Code Repository: https://github.com/kcharithreddy/load-balancer</w:t>
               <w:br/>
               <w:t>• Target Results: 100.0% Completeness (20,000 / 20,000), 100.0% Correctness, 0.00% Error Rate</w:t>
               <w:br/>
@@ -239,7 +241,7 @@
               <w:rPr>
                 <w:sz w:val="19"/>
               </w:rPr>
-              <w:t>/message Success Rate</w:t>
+              <w:t>GitHub Repository</w:t>
             </w:r>
           </w:p>
         </w:tc>
@@ -259,6 +261,68 @@
               <w:rPr>
                 <w:sz w:val="19"/>
               </w:rPr>
+              <w:t>https://github.com/kcharithreddy/load-balancer</w:t>
+            </w:r>
+          </w:p>
+        </w:tc>
+        <w:tc>
+          <w:tcPr>
+            <w:tcW w:type="dxa" w:w="3120"/>
+            <w:shd w:fill="F9FAFB"/>
+            <w:tcMar>
+              <w:top w:w="80" w:type="dxa"/>
+              <w:bottom w:w="80" w:type="dxa"/>
+              <w:left w:w="100" w:type="dxa"/>
+              <w:right w:w="100" w:type="dxa"/>
+            </w:tcMar>
+          </w:tcPr>
+          <w:p>
+            <w:r>
+              <w:rPr>
+                <w:sz w:val="19"/>
+              </w:rPr>
+              <w:t>📦 Source Code Public</w:t>
+            </w:r>
+          </w:p>
+        </w:tc>
+      </w:tr>
+      <w:tr>
+        <w:tc>
+          <w:tcPr>
+            <w:tcW w:type="dxa" w:w="3120"/>
+            <w:shd w:fill="FFFFFF"/>
+            <w:tcMar>
+              <w:top w:w="80" w:type="dxa"/>
+              <w:bottom w:w="80" w:type="dxa"/>
+              <w:left w:w="100" w:type="dxa"/>
+              <w:right w:w="100" w:type="dxa"/>
+            </w:tcMar>
+          </w:tcPr>
+          <w:p>
+            <w:r>
+              <w:rPr>
+                <w:sz w:val="19"/>
+              </w:rPr>
+              <w:t>/message Success Rate</w:t>
+            </w:r>
+          </w:p>
+        </w:tc>
+        <w:tc>
+          <w:tcPr>
+            <w:tcW w:type="dxa" w:w="3120"/>
+            <w:shd w:fill="FFFFFF"/>
+            <w:tcMar>
+              <w:top w:w="80" w:type="dxa"/>
+              <w:bottom w:w="80" w:type="dxa"/>
+              <w:left w:w="100" w:type="dxa"/>
+              <w:right w:w="100" w:type="dxa"/>
+            </w:tcMar>
+          </w:tcPr>
+          <w:p>
+            <w:r>
+              <w:rPr>
+                <w:sz w:val="19"/>
+              </w:rPr>
               <w:t>100.0% (1,000 / 1,000 Requests)</w:t>
             </w:r>
           </w:p>
@@ -266,7 +330,7 @@
         <w:tc>
           <w:tcPr>
             <w:tcW w:type="dxa" w:w="3120"/>
-            <w:shd w:fill="F9FAFB"/>
+            <w:shd w:fill="FFFFFF"/>
             <w:tcMar>
               <w:top w:w="80" w:type="dxa"/>
               <w:bottom w:w="80" w:type="dxa"/>
@@ -288,7 +352,7 @@
         <w:tc>
           <w:tcPr>
             <w:tcW w:type="dxa" w:w="3120"/>
-            <w:shd w:fill="FFFFFF"/>
+            <w:shd w:fill="F9FAFB"/>
             <w:tcMar>
               <w:top w:w="80" w:type="dxa"/>
               <w:bottom w:w="80" w:type="dxa"/>
@@ -308,7 +372,7 @@
         <w:tc>
           <w:tcPr>
             <w:tcW w:type="dxa" w:w="3120"/>
-            <w:shd w:fill="FFFFFF"/>
+            <w:shd w:fill="F9FAFB"/>
             <w:tcMar>
               <w:top w:w="80" w:type="dxa"/>
               <w:bottom w:w="80" w:type="dxa"/>
@@ -328,7 +392,7 @@
         <w:tc>
           <w:tcPr>
             <w:tcW w:type="dxa" w:w="3120"/>
-            <w:shd w:fill="FFFFFF"/>
+            <w:shd w:fill="F9FAFB"/>
             <w:tcMar>
               <w:top w:w="80" w:type="dxa"/>
               <w:bottom w:w="80" w:type="dxa"/>
@@ -350,7 +414,7 @@
         <w:tc>
           <w:tcPr>
             <w:tcW w:type="dxa" w:w="3120"/>
-            <w:shd w:fill="F9FAFB"/>
+            <w:shd w:fill="FFFFFF"/>
             <w:tcMar>
               <w:top w:w="80" w:type="dxa"/>
               <w:bottom w:w="80" w:type="dxa"/>
@@ -370,7 +434,7 @@
         <w:tc>
           <w:tcPr>
             <w:tcW w:type="dxa" w:w="3120"/>
-            <w:shd w:fill="F9FAFB"/>
+            <w:shd w:fill="FFFFFF"/>
             <w:tcMar>
               <w:top w:w="80" w:type="dxa"/>
               <w:bottom w:w="80" w:type="dxa"/>
@@ -390,7 +454,7 @@
         <w:tc>
           <w:tcPr>
             <w:tcW w:type="dxa" w:w="3120"/>
-            <w:shd w:fill="F9FAFB"/>
+            <w:shd w:fill="FFFFFF"/>
             <w:tcMar>
               <w:top w:w="80" w:type="dxa"/>
               <w:bottom w:w="80" w:type="dxa"/>
@@ -412,7 +476,7 @@
         <w:tc>
           <w:tcPr>
             <w:tcW w:type="dxa" w:w="3120"/>
-            <w:shd w:fill="FFFFFF"/>
+            <w:shd w:fill="F9FAFB"/>
             <w:tcMar>
               <w:top w:w="80" w:type="dxa"/>
               <w:bottom w:w="80" w:type="dxa"/>
@@ -432,7 +496,7 @@
         <w:tc>
           <w:tcPr>
             <w:tcW w:type="dxa" w:w="3120"/>
-            <w:shd w:fill="FFFFFF"/>
+            <w:shd w:fill="F9FAFB"/>
             <w:tcMar>
               <w:top w:w="80" w:type="dxa"/>
               <w:bottom w:w="80" w:type="dxa"/>
@@ -452,7 +516,7 @@
         <w:tc>
           <w:tcPr>
             <w:tcW w:type="dxa" w:w="3120"/>
-            <w:shd w:fill="FFFFFF"/>
+            <w:shd w:fill="F9FAFB"/>
             <w:tcMar>
               <w:top w:w="80" w:type="dxa"/>
               <w:bottom w:w="80" w:type="dxa"/>
@@ -474,7 +538,7 @@
         <w:tc>
           <w:tcPr>
             <w:tcW w:type="dxa" w:w="3120"/>
-            <w:shd w:fill="F9FAFB"/>
+            <w:shd w:fill="FFFFFF"/>
             <w:tcMar>
               <w:top w:w="80" w:type="dxa"/>
               <w:bottom w:w="80" w:type="dxa"/>
@@ -494,7 +558,7 @@
         <w:tc>
           <w:tcPr>
             <w:tcW w:type="dxa" w:w="3120"/>
-            <w:shd w:fill="F9FAFB"/>
+            <w:shd w:fill="FFFFFF"/>
             <w:tcMar>
               <w:top w:w="80" w:type="dxa"/>
               <w:bottom w:w="80" w:type="dxa"/>
@@ -514,7 +578,7 @@
         <w:tc>
           <w:tcPr>
             <w:tcW w:type="dxa" w:w="3120"/>
-            <w:shd w:fill="F9FAFB"/>
+            <w:shd w:fill="FFFFFF"/>
             <w:tcMar>
               <w:top w:w="80" w:type="dxa"/>
               <w:bottom w:w="80" w:type="dxa"/>
@@ -672,12 +736,12 @@
         <w:rPr>
           <w:color w:val="003366"/>
         </w:rPr>
-        <w:t>4. REST API Specifications &amp; Compliance</w:t>
+        <w:t>4. REST API Specifications &amp; GitHub Repository</w:t>
       </w:r>
     </w:p>
     <w:p>
       <w:r>
-        <w:t>The deployed system maintains exact byte-for-byte REST API contract compliance:</w:t>
+        <w:t>The deployed system maintains exact byte-for-byte REST API contract compliance. Full source code is available at https://github.com/kcharithreddy/load-balancer:</w:t>
       </w:r>
     </w:p>
     <w:p>
@@ -720,6 +784,18 @@
       </w:r>
       <w:r>
         <w:t>Provides real-time load balancer observability metrics, total requests processed, active in-flight requests, and individual backend health status.</w:t>
+      </w:r>
+    </w:p>
+    <w:p>
+      <w:r>
+        <w:rPr>
+          <w:b/>
+        </w:rPr>
+        <w:t>• GitHub Repository Link</w:t>
+        <w:br/>
+      </w:r>
+      <w:r>
+        <w:t>https://github.com/kcharithreddy/load-balancer</w:t>
       </w:r>
     </w:p>
     <w:sectPr>

</xml_diff>